<commit_message>
Confirm it's you (step-up) before sensitive actions, and SMS alerts for sign-ins from new browsers
Owner request 2026-10-15.
- Step-up: fresh SMS code before Users, Settings (system, places, lists, rights), report
  downloads and uploads; 15 minutes per confirmation; enforced in the API ([RequireStepUp],
  token claim stepup_time kept on refresh) and asked for first by the web app.
- Sign-in alerts: KnownDevices (keyed hash of a random browser key in an HttpOnly cookie);
  a browser new to the account sends the person an SMS; first browser recorded quietly.
- Migration AddStepUpAndKnownDevices (KnownDevices, OtpRequests.Purpose);
  rollback: dotnet ef database update AddBrandLogo.
- Sign-in and confirmation codes share one checked routine (limits, lockout, single use).
- 6 tests; UAT guide v1.1 (A-11 to A-13).

Co-Authored-By: Claude Opus 5.5 <noreply@anthropic.com>
</commit_message>
<xml_diff>
--- a/Docs/UAT/CIP_UAT_and_Training_Guide.docx
+++ b/Docs/UAT/CIP_UAT_and_Training_Guide.docx
@@ -107,7 +107,7 @@
           <w:sz w:val="22"/>
           <w:szCs w:val="22"/>
         </w:rPr>
-        <w:t xml:space="preserve">Version 1.0 — 15 October 2026</w:t>
+        <w:t xml:space="preserve">Version 1.1 — 15 October 2026</w:t>
       </w:r>
     </w:p>
     <w:p>
@@ -969,7 +969,7 @@
           <w:sz w:val="20"/>
           <w:szCs w:val="20"/>
         </w:rPr>
-        <w:t xml:space="preserve">74 tests in 14 areas: signing in and security, Dashboard, Voters, Quick entry, Encounters, Pledges, Influencers, Reports, uploads, Users, Settings, Audit Trail, access control and phone use.</w:t>
+        <w:t xml:space="preserve">77 tests in 14 areas: signing in and security, Dashboard, Voters, Quick entry, Encounters, Pledges, Influencers, Reports, uploads, Users, Settings, Audit Trail, access control and phone use.</w:t>
       </w:r>
     </w:p>
     <w:p>
@@ -2426,6 +2426,19 @@
     <w:p>
       <w:pPr>
         <w:spacing w:after="100" w:before="0"/>
+      </w:pPr>
+      <w:r>
+        <w:rPr>
+          <w:rFonts w:ascii="Segoe UI" w:cs="Segoe UI" w:eastAsia="Segoe UI" w:hAnsi="Segoe UI"/>
+          <w:sz w:val="20"/>
+          <w:szCs w:val="20"/>
+        </w:rPr>
+        <w:t xml:space="preserve">Sensitive areas (Users, Settings → System / places / lists / Roles &amp; rights, report downloads, uploads) first ask you to "Confirm it's you" with a code sent by SMS; one confirmation lasts about 15 minutes.</w:t>
+      </w:r>
+    </w:p>
+    <w:p>
+      <w:pPr>
+        <w:spacing w:after="100" w:before="0"/>
         <w:sectPr>
           <w:footerReference w:type="default" r:id="rId6"/>
           <w:pgSz w:w="11906" w:h="16838" w:orient="portrait"/>
@@ -4513,6 +4526,532 @@
           </w:p>
         </w:tc>
       </w:tr>
+      <w:tr>
+        <w:trPr>
+          <w:cantSplit/>
+        </w:trPr>
+        <w:tc>
+          <w:tcPr>
+            <w:tcW w:type="dxa" w:w="800"/>
+            <w:tcMar>
+              <w:top w:type="dxa" w:w="60"/>
+              <w:left w:type="dxa" w:w="90"/>
+              <w:bottom w:type="dxa" w:w="60"/>
+              <w:right w:type="dxa" w:w="90"/>
+            </w:tcMar>
+          </w:tcPr>
+          <w:p>
+            <w:pPr>
+              <w:spacing w:after="40"/>
+            </w:pPr>
+            <w:r>
+              <w:rPr>
+                <w:rFonts w:ascii="Segoe UI" w:cs="Segoe UI" w:eastAsia="Segoe UI" w:hAnsi="Segoe UI"/>
+                <w:sz w:val="18"/>
+                <w:szCs w:val="18"/>
+              </w:rPr>
+              <w:t xml:space="preserve">A-11</w:t>
+            </w:r>
+          </w:p>
+        </w:tc>
+        <w:tc>
+          <w:tcPr>
+            <w:tcW w:type="dxa" w:w="1900"/>
+            <w:tcMar>
+              <w:top w:type="dxa" w:w="60"/>
+              <w:left w:type="dxa" w:w="90"/>
+              <w:bottom w:type="dxa" w:w="60"/>
+              <w:right w:type="dxa" w:w="90"/>
+            </w:tcMar>
+          </w:tcPr>
+          <w:p>
+            <w:pPr>
+              <w:spacing w:after="40"/>
+            </w:pPr>
+            <w:r>
+              <w:rPr>
+                <w:rFonts w:ascii="Segoe UI" w:cs="Segoe UI" w:eastAsia="Segoe UI" w:hAnsi="Segoe UI"/>
+                <w:sz w:val="18"/>
+                <w:szCs w:val="18"/>
+              </w:rPr>
+              <w:t xml:space="preserve">New-device sign-in alert</w:t>
+            </w:r>
+          </w:p>
+        </w:tc>
+        <w:tc>
+          <w:tcPr>
+            <w:tcW w:type="dxa" w:w="4400"/>
+            <w:tcMar>
+              <w:top w:type="dxa" w:w="60"/>
+              <w:left w:type="dxa" w:w="90"/>
+              <w:bottom w:type="dxa" w:w="60"/>
+              <w:right w:type="dxa" w:w="90"/>
+            </w:tcMar>
+          </w:tcPr>
+          <w:p>
+            <w:pPr>
+              <w:spacing w:after="40"/>
+            </w:pPr>
+            <w:r>
+              <w:rPr>
+                <w:rFonts w:ascii="Segoe UI" w:cs="Segoe UI" w:eastAsia="Segoe UI" w:hAnsi="Segoe UI"/>
+                <w:sz w:val="18"/>
+                <w:szCs w:val="18"/>
+              </w:rPr>
+              <w:t xml:space="preserve">Sign in on your usual phone. Then sign in on another browser or computer (or a private/incognito window).</w:t>
+            </w:r>
+          </w:p>
+        </w:tc>
+        <w:tc>
+          <w:tcPr>
+            <w:tcW w:type="dxa" w:w="3700"/>
+            <w:tcMar>
+              <w:top w:type="dxa" w:w="60"/>
+              <w:left w:type="dxa" w:w="90"/>
+              <w:bottom w:type="dxa" w:w="60"/>
+              <w:right w:type="dxa" w:w="90"/>
+            </w:tcMar>
+          </w:tcPr>
+          <w:p>
+            <w:pPr>
+              <w:spacing w:after="40"/>
+            </w:pPr>
+            <w:r>
+              <w:rPr>
+                <w:rFonts w:ascii="Segoe UI" w:cs="Segoe UI" w:eastAsia="Segoe UI" w:hAnsi="Segoe UI"/>
+                <w:sz w:val="18"/>
+                <w:szCs w:val="18"/>
+              </w:rPr>
+              <w:t xml:space="preserve">First device: no alert. The other browser: SMS "new sign-in to your account at HH:MM on &lt;browser&gt;… contact your administrator". Same browser again: no alert.</w:t>
+            </w:r>
+          </w:p>
+        </w:tc>
+        <w:tc>
+          <w:tcPr>
+            <w:tcW w:type="dxa" w:w="1500"/>
+            <w:tcMar>
+              <w:top w:type="dxa" w:w="60"/>
+              <w:left w:type="dxa" w:w="90"/>
+              <w:bottom w:type="dxa" w:w="60"/>
+              <w:right w:type="dxa" w:w="90"/>
+            </w:tcMar>
+          </w:tcPr>
+          <w:p>
+            <w:pPr>
+              <w:spacing w:after="40"/>
+            </w:pPr>
+            <w:r>
+              <w:rPr>
+                <w:rFonts w:ascii="Segoe UI" w:cs="Segoe UI" w:eastAsia="Segoe UI" w:hAnsi="Segoe UI"/>
+                <w:sz w:val="18"/>
+                <w:szCs w:val="18"/>
+              </w:rPr>
+              <w:t xml:space="preserve">All</w:t>
+            </w:r>
+          </w:p>
+        </w:tc>
+        <w:tc>
+          <w:tcPr>
+            <w:tcW w:type="dxa" w:w="800"/>
+            <w:tcMar>
+              <w:top w:type="dxa" w:w="60"/>
+              <w:left w:type="dxa" w:w="90"/>
+              <w:bottom w:type="dxa" w:w="60"/>
+              <w:right w:type="dxa" w:w="90"/>
+            </w:tcMar>
+          </w:tcPr>
+          <w:p>
+            <w:pPr>
+              <w:spacing w:after="40"/>
+            </w:pPr>
+            <w:r>
+              <w:rPr>
+                <w:rFonts w:ascii="Segoe UI" w:cs="Segoe UI" w:eastAsia="Segoe UI" w:hAnsi="Segoe UI"/>
+                <w:sz w:val="18"/>
+                <w:szCs w:val="18"/>
+              </w:rPr>
+              <w:t xml:space="preserve"/>
+            </w:r>
+          </w:p>
+        </w:tc>
+        <w:tc>
+          <w:tcPr>
+            <w:tcW w:type="dxa" w:w="1600"/>
+            <w:tcMar>
+              <w:top w:type="dxa" w:w="60"/>
+              <w:left w:type="dxa" w:w="90"/>
+              <w:bottom w:type="dxa" w:w="60"/>
+              <w:right w:type="dxa" w:w="90"/>
+            </w:tcMar>
+          </w:tcPr>
+          <w:p>
+            <w:pPr>
+              <w:spacing w:after="40"/>
+            </w:pPr>
+            <w:r>
+              <w:rPr>
+                <w:rFonts w:ascii="Segoe UI" w:cs="Segoe UI" w:eastAsia="Segoe UI" w:hAnsi="Segoe UI"/>
+                <w:sz w:val="18"/>
+                <w:szCs w:val="18"/>
+              </w:rPr>
+              <w:t xml:space="preserve"/>
+            </w:r>
+          </w:p>
+        </w:tc>
+      </w:tr>
+      <w:tr>
+        <w:trPr>
+          <w:cantSplit/>
+        </w:trPr>
+        <w:tc>
+          <w:tcPr>
+            <w:tcW w:type="dxa" w:w="800"/>
+            <w:shd w:fill="F8FAFC" w:color="auto" w:val="clear"/>
+            <w:tcMar>
+              <w:top w:type="dxa" w:w="60"/>
+              <w:left w:type="dxa" w:w="90"/>
+              <w:bottom w:type="dxa" w:w="60"/>
+              <w:right w:type="dxa" w:w="90"/>
+            </w:tcMar>
+          </w:tcPr>
+          <w:p>
+            <w:pPr>
+              <w:spacing w:after="40"/>
+            </w:pPr>
+            <w:r>
+              <w:rPr>
+                <w:rFonts w:ascii="Segoe UI" w:cs="Segoe UI" w:eastAsia="Segoe UI" w:hAnsi="Segoe UI"/>
+                <w:sz w:val="18"/>
+                <w:szCs w:val="18"/>
+              </w:rPr>
+              <w:t xml:space="preserve">A-12</w:t>
+            </w:r>
+          </w:p>
+        </w:tc>
+        <w:tc>
+          <w:tcPr>
+            <w:tcW w:type="dxa" w:w="1900"/>
+            <w:shd w:fill="F8FAFC" w:color="auto" w:val="clear"/>
+            <w:tcMar>
+              <w:top w:type="dxa" w:w="60"/>
+              <w:left w:type="dxa" w:w="90"/>
+              <w:bottom w:type="dxa" w:w="60"/>
+              <w:right w:type="dxa" w:w="90"/>
+            </w:tcMar>
+          </w:tcPr>
+          <w:p>
+            <w:pPr>
+              <w:spacing w:after="40"/>
+            </w:pPr>
+            <w:r>
+              <w:rPr>
+                <w:rFonts w:ascii="Segoe UI" w:cs="Segoe UI" w:eastAsia="Segoe UI" w:hAnsi="Segoe UI"/>
+                <w:sz w:val="18"/>
+                <w:szCs w:val="18"/>
+              </w:rPr>
+              <w:t xml:space="preserve">Confirm it's you</w:t>
+            </w:r>
+          </w:p>
+        </w:tc>
+        <w:tc>
+          <w:tcPr>
+            <w:tcW w:type="dxa" w:w="4400"/>
+            <w:shd w:fill="F8FAFC" w:color="auto" w:val="clear"/>
+            <w:tcMar>
+              <w:top w:type="dxa" w:w="60"/>
+              <w:left w:type="dxa" w:w="90"/>
+              <w:bottom w:type="dxa" w:w="60"/>
+              <w:right w:type="dxa" w:w="90"/>
+            </w:tcMar>
+          </w:tcPr>
+          <w:p>
+            <w:pPr>
+              <w:spacing w:after="40"/>
+            </w:pPr>
+            <w:r>
+              <w:rPr>
+                <w:rFonts w:ascii="Segoe UI" w:cs="Segoe UI" w:eastAsia="Segoe UI" w:hAnsi="Segoe UI"/>
+                <w:sz w:val="18"/>
+                <w:szCs w:val="18"/>
+              </w:rPr>
+              <w:t xml:space="preserve">As Administrator open Users (or Settings → System, or download a report).</w:t>
+            </w:r>
+          </w:p>
+        </w:tc>
+        <w:tc>
+          <w:tcPr>
+            <w:tcW w:type="dxa" w:w="3700"/>
+            <w:shd w:fill="F8FAFC" w:color="auto" w:val="clear"/>
+            <w:tcMar>
+              <w:top w:type="dxa" w:w="60"/>
+              <w:left w:type="dxa" w:w="90"/>
+              <w:bottom w:type="dxa" w:w="60"/>
+              <w:right w:type="dxa" w:w="90"/>
+            </w:tcMar>
+          </w:tcPr>
+          <w:p>
+            <w:pPr>
+              <w:spacing w:after="40"/>
+            </w:pPr>
+            <w:r>
+              <w:rPr>
+                <w:rFonts w:ascii="Segoe UI" w:cs="Segoe UI" w:eastAsia="Segoe UI" w:hAnsi="Segoe UI"/>
+                <w:sz w:val="18"/>
+                <w:szCs w:val="18"/>
+              </w:rPr>
+              <w:t xml:space="preserve">"Confirm it's you" page: Send me a code → SMS code → Confirm → back on the page you opened. For about 15 minutes no new code is asked; after that it asks again.</w:t>
+            </w:r>
+          </w:p>
+        </w:tc>
+        <w:tc>
+          <w:tcPr>
+            <w:tcW w:type="dxa" w:w="1500"/>
+            <w:shd w:fill="F8FAFC" w:color="auto" w:val="clear"/>
+            <w:tcMar>
+              <w:top w:type="dxa" w:w="60"/>
+              <w:left w:type="dxa" w:w="90"/>
+              <w:bottom w:type="dxa" w:w="60"/>
+              <w:right w:type="dxa" w:w="90"/>
+            </w:tcMar>
+          </w:tcPr>
+          <w:p>
+            <w:pPr>
+              <w:spacing w:after="40"/>
+            </w:pPr>
+            <w:r>
+              <w:rPr>
+                <w:rFonts w:ascii="Segoe UI" w:cs="Segoe UI" w:eastAsia="Segoe UI" w:hAnsi="Segoe UI"/>
+                <w:sz w:val="18"/>
+                <w:szCs w:val="18"/>
+              </w:rPr>
+              <w:t xml:space="preserve">Administrator</w:t>
+            </w:r>
+          </w:p>
+        </w:tc>
+        <w:tc>
+          <w:tcPr>
+            <w:tcW w:type="dxa" w:w="800"/>
+            <w:shd w:fill="F8FAFC" w:color="auto" w:val="clear"/>
+            <w:tcMar>
+              <w:top w:type="dxa" w:w="60"/>
+              <w:left w:type="dxa" w:w="90"/>
+              <w:bottom w:type="dxa" w:w="60"/>
+              <w:right w:type="dxa" w:w="90"/>
+            </w:tcMar>
+          </w:tcPr>
+          <w:p>
+            <w:pPr>
+              <w:spacing w:after="40"/>
+            </w:pPr>
+            <w:r>
+              <w:rPr>
+                <w:rFonts w:ascii="Segoe UI" w:cs="Segoe UI" w:eastAsia="Segoe UI" w:hAnsi="Segoe UI"/>
+                <w:sz w:val="18"/>
+                <w:szCs w:val="18"/>
+              </w:rPr>
+              <w:t xml:space="preserve"/>
+            </w:r>
+          </w:p>
+        </w:tc>
+        <w:tc>
+          <w:tcPr>
+            <w:tcW w:type="dxa" w:w="1600"/>
+            <w:shd w:fill="F8FAFC" w:color="auto" w:val="clear"/>
+            <w:tcMar>
+              <w:top w:type="dxa" w:w="60"/>
+              <w:left w:type="dxa" w:w="90"/>
+              <w:bottom w:type="dxa" w:w="60"/>
+              <w:right w:type="dxa" w:w="90"/>
+            </w:tcMar>
+          </w:tcPr>
+          <w:p>
+            <w:pPr>
+              <w:spacing w:after="40"/>
+            </w:pPr>
+            <w:r>
+              <w:rPr>
+                <w:rFonts w:ascii="Segoe UI" w:cs="Segoe UI" w:eastAsia="Segoe UI" w:hAnsi="Segoe UI"/>
+                <w:sz w:val="18"/>
+                <w:szCs w:val="18"/>
+              </w:rPr>
+              <w:t xml:space="preserve"/>
+            </w:r>
+          </w:p>
+        </w:tc>
+      </w:tr>
+      <w:tr>
+        <w:trPr>
+          <w:cantSplit/>
+        </w:trPr>
+        <w:tc>
+          <w:tcPr>
+            <w:tcW w:type="dxa" w:w="800"/>
+            <w:tcMar>
+              <w:top w:type="dxa" w:w="60"/>
+              <w:left w:type="dxa" w:w="90"/>
+              <w:bottom w:type="dxa" w:w="60"/>
+              <w:right w:type="dxa" w:w="90"/>
+            </w:tcMar>
+          </w:tcPr>
+          <w:p>
+            <w:pPr>
+              <w:spacing w:after="40"/>
+            </w:pPr>
+            <w:r>
+              <w:rPr>
+                <w:rFonts w:ascii="Segoe UI" w:cs="Segoe UI" w:eastAsia="Segoe UI" w:hAnsi="Segoe UI"/>
+                <w:sz w:val="18"/>
+                <w:szCs w:val="18"/>
+              </w:rPr>
+              <w:t xml:space="preserve">A-13</w:t>
+            </w:r>
+          </w:p>
+        </w:tc>
+        <w:tc>
+          <w:tcPr>
+            <w:tcW w:type="dxa" w:w="1900"/>
+            <w:tcMar>
+              <w:top w:type="dxa" w:w="60"/>
+              <w:left w:type="dxa" w:w="90"/>
+              <w:bottom w:type="dxa" w:w="60"/>
+              <w:right w:type="dxa" w:w="90"/>
+            </w:tcMar>
+          </w:tcPr>
+          <w:p>
+            <w:pPr>
+              <w:spacing w:after="40"/>
+            </w:pPr>
+            <w:r>
+              <w:rPr>
+                <w:rFonts w:ascii="Segoe UI" w:cs="Segoe UI" w:eastAsia="Segoe UI" w:hAnsi="Segoe UI"/>
+                <w:sz w:val="18"/>
+                <w:szCs w:val="18"/>
+              </w:rPr>
+              <w:t xml:space="preserve">Confirm it's you: wrong code</w:t>
+            </w:r>
+          </w:p>
+        </w:tc>
+        <w:tc>
+          <w:tcPr>
+            <w:tcW w:type="dxa" w:w="4400"/>
+            <w:tcMar>
+              <w:top w:type="dxa" w:w="60"/>
+              <w:left w:type="dxa" w:w="90"/>
+              <w:bottom w:type="dxa" w:w="60"/>
+              <w:right w:type="dxa" w:w="90"/>
+            </w:tcMar>
+          </w:tcPr>
+          <w:p>
+            <w:pPr>
+              <w:spacing w:after="40"/>
+            </w:pPr>
+            <w:r>
+              <w:rPr>
+                <w:rFonts w:ascii="Segoe UI" w:cs="Segoe UI" w:eastAsia="Segoe UI" w:hAnsi="Segoe UI"/>
+                <w:sz w:val="18"/>
+                <w:szCs w:val="18"/>
+              </w:rPr>
+              <w:t xml:space="preserve">On the Confirm page enter a wrong code, then the right one.</w:t>
+            </w:r>
+          </w:p>
+        </w:tc>
+        <w:tc>
+          <w:tcPr>
+            <w:tcW w:type="dxa" w:w="3700"/>
+            <w:tcMar>
+              <w:top w:type="dxa" w:w="60"/>
+              <w:left w:type="dxa" w:w="90"/>
+              <w:bottom w:type="dxa" w:w="60"/>
+              <w:right w:type="dxa" w:w="90"/>
+            </w:tcMar>
+          </w:tcPr>
+          <w:p>
+            <w:pPr>
+              <w:spacing w:after="40"/>
+            </w:pPr>
+            <w:r>
+              <w:rPr>
+                <w:rFonts w:ascii="Segoe UI" w:cs="Segoe UI" w:eastAsia="Segoe UI" w:hAnsi="Segoe UI"/>
+                <w:sz w:val="18"/>
+                <w:szCs w:val="18"/>
+              </w:rPr>
+              <w:t xml:space="preserve">"That code is not correct. You have N tries left." The right code works. A confirmation code cannot be used to sign in.</w:t>
+            </w:r>
+          </w:p>
+        </w:tc>
+        <w:tc>
+          <w:tcPr>
+            <w:tcW w:type="dxa" w:w="1500"/>
+            <w:tcMar>
+              <w:top w:type="dxa" w:w="60"/>
+              <w:left w:type="dxa" w:w="90"/>
+              <w:bottom w:type="dxa" w:w="60"/>
+              <w:right w:type="dxa" w:w="90"/>
+            </w:tcMar>
+          </w:tcPr>
+          <w:p>
+            <w:pPr>
+              <w:spacing w:after="40"/>
+            </w:pPr>
+            <w:r>
+              <w:rPr>
+                <w:rFonts w:ascii="Segoe UI" w:cs="Segoe UI" w:eastAsia="Segoe UI" w:hAnsi="Segoe UI"/>
+                <w:sz w:val="18"/>
+                <w:szCs w:val="18"/>
+              </w:rPr>
+              <w:t xml:space="preserve">Administrator</w:t>
+            </w:r>
+          </w:p>
+        </w:tc>
+        <w:tc>
+          <w:tcPr>
+            <w:tcW w:type="dxa" w:w="800"/>
+            <w:tcMar>
+              <w:top w:type="dxa" w:w="60"/>
+              <w:left w:type="dxa" w:w="90"/>
+              <w:bottom w:type="dxa" w:w="60"/>
+              <w:right w:type="dxa" w:w="90"/>
+            </w:tcMar>
+          </w:tcPr>
+          <w:p>
+            <w:pPr>
+              <w:spacing w:after="40"/>
+            </w:pPr>
+            <w:r>
+              <w:rPr>
+                <w:rFonts w:ascii="Segoe UI" w:cs="Segoe UI" w:eastAsia="Segoe UI" w:hAnsi="Segoe UI"/>
+                <w:sz w:val="18"/>
+                <w:szCs w:val="18"/>
+              </w:rPr>
+              <w:t xml:space="preserve"/>
+            </w:r>
+          </w:p>
+        </w:tc>
+        <w:tc>
+          <w:tcPr>
+            <w:tcW w:type="dxa" w:w="1600"/>
+            <w:tcMar>
+              <w:top w:type="dxa" w:w="60"/>
+              <w:left w:type="dxa" w:w="90"/>
+              <w:bottom w:type="dxa" w:w="60"/>
+              <w:right w:type="dxa" w:w="90"/>
+            </w:tcMar>
+          </w:tcPr>
+          <w:p>
+            <w:pPr>
+              <w:spacing w:after="40"/>
+            </w:pPr>
+            <w:r>
+              <w:rPr>
+                <w:rFonts w:ascii="Segoe UI" w:cs="Segoe UI" w:eastAsia="Segoe UI" w:hAnsi="Segoe UI"/>
+                <w:sz w:val="18"/>
+                <w:szCs w:val="18"/>
+              </w:rPr>
+              <w:t xml:space="preserve"/>
+            </w:r>
+          </w:p>
+        </w:tc>
+      </w:tr>
     </w:tbl>
     <w:p>
       <w:pPr>
@@ -19102,7 +19641,7 @@
                 <w:sz w:val="18"/>
                 <w:szCs w:val="18"/>
               </w:rPr>
-              <w:t xml:space="preserve">10</w:t>
+              <w:t xml:space="preserve">13</w:t>
             </w:r>
           </w:p>
         </w:tc>
@@ -21188,7 +21727,7 @@
                 <w:sz w:val="18"/>
                 <w:szCs w:val="18"/>
               </w:rPr>
-              <w:t xml:space="preserve">74</w:t>
+              <w:t xml:space="preserve">77</w:t>
             </w:r>
           </w:p>
         </w:tc>
@@ -25843,7 +26382,7 @@
         <w:sz w:val="16"/>
         <w:szCs w:val="16"/>
       </w:rPr>
-      <w:t xml:space="preserve">Campaign Intelligence Platform (CIP) — UAT &amp; Training Guide v1.0 — page </w:t>
+      <w:t xml:space="preserve">Campaign Intelligence Platform (CIP) — UAT &amp; Training Guide v1.1 — page </w:t>
     </w:r>
     <w:r>
       <w:rPr>
@@ -25874,7 +26413,7 @@
         <w:sz w:val="16"/>
         <w:szCs w:val="16"/>
       </w:rPr>
-      <w:t xml:space="preserve">Campaign Intelligence Platform (CIP) — UAT &amp; Training Guide v1.0 — page </w:t>
+      <w:t xml:space="preserve">Campaign Intelligence Platform (CIP) — UAT &amp; Training Guide v1.1 — page </w:t>
     </w:r>
     <w:r>
       <w:rPr>
@@ -25905,7 +26444,7 @@
         <w:sz w:val="16"/>
         <w:szCs w:val="16"/>
       </w:rPr>
-      <w:t xml:space="preserve">Campaign Intelligence Platform (CIP) — UAT &amp; Training Guide v1.0 — page </w:t>
+      <w:t xml:space="preserve">Campaign Intelligence Platform (CIP) — UAT &amp; Training Guide v1.1 — page </w:t>
     </w:r>
     <w:r>
       <w:rPr>

</xml_diff>

<commit_message>
Golden colour theme (light and dark), chosen per device or as the campaign default
Owner request 2026-10-15 (client wanted golden yellow).
- theme-gold.css: warm ivory + espresso sidebar + gold highlights (light), warm black + gold
  (dark); gold fills with dark ink, deep gold (4.9:1) for text on white; sign-in pages too.
- Written-out blues turned into CSS variables (same classic values).
- Settings → Appearance → Colour and a Classic / Golden switch in the user menu (per device);
  Settings → System → Branding → Colour theme = campaign default (ThemeAccent, audited,
  public branding for the sign-in pages).
- Test for the default colour setting; UAT K-01, K-01b.

Co-Authored-By: Claude Opus 5.5 <noreply@anthropic.com>
</commit_message>
<xml_diff>
--- a/Docs/UAT/CIP_UAT_and_Training_Guide.docx
+++ b/Docs/UAT/CIP_UAT_and_Training_Guide.docx
@@ -969,7 +969,7 @@
           <w:sz w:val="20"/>
           <w:szCs w:val="20"/>
         </w:rPr>
-        <w:t xml:space="preserve">77 tests in 14 areas: signing in and security, Dashboard, Voters, Quick entry, Encounters, Pledges, Influencers, Reports, uploads, Users, Settings, Audit Trail, access control and phone use.</w:t>
+        <w:t xml:space="preserve">78 tests in 14 areas: signing in and security, Dashboard, Voters, Quick entry, Encounters, Pledges, Influencers, Reports, uploads, Users, Settings, Audit Trail, access control and phone use.</w:t>
       </w:r>
     </w:p>
     <w:p>
@@ -16458,7 +16458,7 @@
                 <w:sz w:val="18"/>
                 <w:szCs w:val="18"/>
               </w:rPr>
-              <w:t xml:space="preserve">Settings → Appearance → Dark.</w:t>
+              <w:t xml:space="preserve">Settings → Appearance → Dark; then Colour → Golden; then back. Also try the Dark mode switch and Classic / Golden in the menu under your name.</w:t>
             </w:r>
           </w:p>
         </w:tc>
@@ -16482,7 +16482,7 @@
                 <w:sz w:val="18"/>
                 <w:szCs w:val="18"/>
               </w:rPr>
-              <w:t xml:space="preserve">Whole app switches to dark; remembered next time.</w:t>
+              <w:t xml:space="preserve">Whole app switches at once (Light / Dark × Classic / Golden); remembered on this device next time.</w:t>
             </w:r>
           </w:p>
         </w:tc>
@@ -16584,7 +16584,7 @@
                 <w:sz w:val="18"/>
                 <w:szCs w:val="18"/>
               </w:rPr>
-              <w:t xml:space="preserve">K-02</w:t>
+              <w:t xml:space="preserve">K-01b</w:t>
             </w:r>
           </w:p>
         </w:tc>
@@ -16609,7 +16609,7 @@
                 <w:sz w:val="18"/>
                 <w:szCs w:val="18"/>
               </w:rPr>
-              <w:t xml:space="preserve">Branding</w:t>
+              <w:t xml:space="preserve">Campaign colour</w:t>
             </w:r>
           </w:p>
         </w:tc>
@@ -16634,7 +16634,7 @@
                 <w:sz w:val="18"/>
                 <w:szCs w:val="18"/>
               </w:rPr>
-              <w:t xml:space="preserve">Settings → System → Branding: campaign name, short name, tagline, logo.</w:t>
+              <w:t xml:space="preserve">Settings → System → Branding → Colour theme → Golden → Save. Sign out.</w:t>
             </w:r>
           </w:p>
         </w:tc>
@@ -16659,7 +16659,7 @@
                 <w:sz w:val="18"/>
                 <w:szCs w:val="18"/>
               </w:rPr>
-              <w:t xml:space="preserve">Shown on sign-in pages, sidebar, page titles and the page loader. "Powered by CIP" stays in the footer.</w:t>
+              <w:t xml:space="preserve">The sign-in pages and everyone who hasn't chosen their own colour see Golden. Audit Trail records the change.</w:t>
             </w:r>
           </w:p>
         </w:tc>
@@ -16763,7 +16763,7 @@
                 <w:sz w:val="18"/>
                 <w:szCs w:val="18"/>
               </w:rPr>
-              <w:t xml:space="preserve">K-03</w:t>
+              <w:t xml:space="preserve">K-02</w:t>
             </w:r>
           </w:p>
         </w:tc>
@@ -16787,7 +16787,7 @@
                 <w:sz w:val="18"/>
                 <w:szCs w:val="18"/>
               </w:rPr>
-              <w:t xml:space="preserve">Sign-in security</w:t>
+              <w:t xml:space="preserve">Branding</w:t>
             </w:r>
           </w:p>
         </w:tc>
@@ -16811,7 +16811,7 @@
                 <w:sz w:val="18"/>
                 <w:szCs w:val="18"/>
               </w:rPr>
-              <w:t xml:space="preserve">Change OTP expiry, maximum attempts, remember-device days.</w:t>
+              <w:t xml:space="preserve">Settings → System → Branding: campaign name, short name, tagline, logo.</w:t>
             </w:r>
           </w:p>
         </w:tc>
@@ -16835,7 +16835,7 @@
                 <w:sz w:val="18"/>
                 <w:szCs w:val="18"/>
               </w:rPr>
-              <w:t xml:space="preserve">Saved; applies to the next code / sign-in. Audit Trail records it.</w:t>
+              <w:t xml:space="preserve">Shown on sign-in pages, sidebar, page titles and the page loader. "Powered by CIP" stays in the footer.</w:t>
             </w:r>
           </w:p>
         </w:tc>
@@ -16937,7 +16937,7 @@
                 <w:sz w:val="18"/>
                 <w:szCs w:val="18"/>
               </w:rPr>
-              <w:t xml:space="preserve">K-04</w:t>
+              <w:t xml:space="preserve">K-03</w:t>
             </w:r>
           </w:p>
         </w:tc>
@@ -16962,7 +16962,7 @@
                 <w:sz w:val="18"/>
                 <w:szCs w:val="18"/>
               </w:rPr>
-              <w:t xml:space="preserve">Constituencies and islands</w:t>
+              <w:t xml:space="preserve">Sign-in security</w:t>
             </w:r>
           </w:p>
         </w:tc>
@@ -16987,7 +16987,7 @@
                 <w:sz w:val="18"/>
                 <w:szCs w:val="18"/>
               </w:rPr>
-              <w:t xml:space="preserve">Add a TEST island to a constituency; rename it; delete it.</w:t>
+              <w:t xml:space="preserve">Change OTP expiry, maximum attempts, remember-device days.</w:t>
             </w:r>
           </w:p>
         </w:tc>
@@ -17012,7 +17012,7 @@
                 <w:sz w:val="18"/>
                 <w:szCs w:val="18"/>
               </w:rPr>
-              <w:t xml:space="preserve">Each island belongs to one constituency; one with voters can't be moved.</w:t>
+              <w:t xml:space="preserve">Saved; applies to the next code / sign-in. Audit Trail records it.</w:t>
             </w:r>
           </w:p>
         </w:tc>
@@ -17116,7 +17116,7 @@
                 <w:sz w:val="18"/>
                 <w:szCs w:val="18"/>
               </w:rPr>
-              <w:t xml:space="preserve">K-05</w:t>
+              <w:t xml:space="preserve">K-04</w:t>
             </w:r>
           </w:p>
         </w:tc>
@@ -17140,7 +17140,7 @@
                 <w:sz w:val="18"/>
                 <w:szCs w:val="18"/>
               </w:rPr>
-              <w:t xml:space="preserve">Lists</w:t>
+              <w:t xml:space="preserve">Constituencies and islands</w:t>
             </w:r>
           </w:p>
         </w:tc>
@@ -17164,7 +17164,7 @@
                 <w:sz w:val="18"/>
                 <w:szCs w:val="18"/>
               </w:rPr>
-              <w:t xml:space="preserve">Lists → political parties and influencer categories: add / rename / delete a TEST entry.</w:t>
+              <w:t xml:space="preserve">Add a TEST island to a constituency; rename it; delete it.</w:t>
             </w:r>
           </w:p>
         </w:tc>
@@ -17188,7 +17188,7 @@
                 <w:sz w:val="18"/>
                 <w:szCs w:val="18"/>
               </w:rPr>
-              <w:t xml:space="preserve">Works; an entry in use can't be deleted.</w:t>
+              <w:t xml:space="preserve">Each island belongs to one constituency; one with voters can't be moved.</w:t>
             </w:r>
           </w:p>
         </w:tc>
@@ -17290,7 +17290,7 @@
                 <w:sz w:val="18"/>
                 <w:szCs w:val="18"/>
               </w:rPr>
-              <w:t xml:space="preserve">K-06</w:t>
+              <w:t xml:space="preserve">K-05</w:t>
             </w:r>
           </w:p>
         </w:tc>
@@ -17315,7 +17315,7 @@
                 <w:sz w:val="18"/>
                 <w:szCs w:val="18"/>
               </w:rPr>
-              <w:t xml:space="preserve">Roles &amp; rights</w:t>
+              <w:t xml:space="preserve">Lists</w:t>
             </w:r>
           </w:p>
         </w:tc>
@@ -17340,7 +17340,7 @@
                 <w:sz w:val="18"/>
                 <w:szCs w:val="18"/>
               </w:rPr>
-              <w:t xml:space="preserve">Create a custom role; tick rights in the grid; set start page and voter-profile view.</w:t>
+              <w:t xml:space="preserve">Lists → political parties and influencer categories: add / rename / delete a TEST entry.</w:t>
             </w:r>
           </w:p>
         </w:tc>
@@ -17365,7 +17365,7 @@
                 <w:sz w:val="18"/>
                 <w:szCs w:val="18"/>
               </w:rPr>
-              <w:t xml:space="preserve">Users with the role get exactly those rights within a minute; built-in roles can't be renamed or deleted.</w:t>
+              <w:t xml:space="preserve">Works; an entry in use can't be deleted.</w:t>
             </w:r>
           </w:p>
         </w:tc>
@@ -17423,6 +17423,179 @@
           <w:tcPr>
             <w:tcW w:type="dxa" w:w="1600"/>
             <w:shd w:fill="F8FAFC" w:color="auto" w:val="clear"/>
+            <w:tcMar>
+              <w:top w:type="dxa" w:w="60"/>
+              <w:left w:type="dxa" w:w="90"/>
+              <w:bottom w:type="dxa" w:w="60"/>
+              <w:right w:type="dxa" w:w="90"/>
+            </w:tcMar>
+          </w:tcPr>
+          <w:p>
+            <w:pPr>
+              <w:spacing w:after="40"/>
+            </w:pPr>
+            <w:r>
+              <w:rPr>
+                <w:rFonts w:ascii="Segoe UI" w:cs="Segoe UI" w:eastAsia="Segoe UI" w:hAnsi="Segoe UI"/>
+                <w:sz w:val="18"/>
+                <w:szCs w:val="18"/>
+              </w:rPr>
+              <w:t xml:space="preserve"/>
+            </w:r>
+          </w:p>
+        </w:tc>
+      </w:tr>
+      <w:tr>
+        <w:trPr>
+          <w:cantSplit/>
+        </w:trPr>
+        <w:tc>
+          <w:tcPr>
+            <w:tcW w:type="dxa" w:w="800"/>
+            <w:tcMar>
+              <w:top w:type="dxa" w:w="60"/>
+              <w:left w:type="dxa" w:w="90"/>
+              <w:bottom w:type="dxa" w:w="60"/>
+              <w:right w:type="dxa" w:w="90"/>
+            </w:tcMar>
+          </w:tcPr>
+          <w:p>
+            <w:pPr>
+              <w:spacing w:after="40"/>
+            </w:pPr>
+            <w:r>
+              <w:rPr>
+                <w:rFonts w:ascii="Segoe UI" w:cs="Segoe UI" w:eastAsia="Segoe UI" w:hAnsi="Segoe UI"/>
+                <w:sz w:val="18"/>
+                <w:szCs w:val="18"/>
+              </w:rPr>
+              <w:t xml:space="preserve">K-06</w:t>
+            </w:r>
+          </w:p>
+        </w:tc>
+        <w:tc>
+          <w:tcPr>
+            <w:tcW w:type="dxa" w:w="1900"/>
+            <w:tcMar>
+              <w:top w:type="dxa" w:w="60"/>
+              <w:left w:type="dxa" w:w="90"/>
+              <w:bottom w:type="dxa" w:w="60"/>
+              <w:right w:type="dxa" w:w="90"/>
+            </w:tcMar>
+          </w:tcPr>
+          <w:p>
+            <w:pPr>
+              <w:spacing w:after="40"/>
+            </w:pPr>
+            <w:r>
+              <w:rPr>
+                <w:rFonts w:ascii="Segoe UI" w:cs="Segoe UI" w:eastAsia="Segoe UI" w:hAnsi="Segoe UI"/>
+                <w:sz w:val="18"/>
+                <w:szCs w:val="18"/>
+              </w:rPr>
+              <w:t xml:space="preserve">Roles &amp; rights</w:t>
+            </w:r>
+          </w:p>
+        </w:tc>
+        <w:tc>
+          <w:tcPr>
+            <w:tcW w:type="dxa" w:w="4400"/>
+            <w:tcMar>
+              <w:top w:type="dxa" w:w="60"/>
+              <w:left w:type="dxa" w:w="90"/>
+              <w:bottom w:type="dxa" w:w="60"/>
+              <w:right w:type="dxa" w:w="90"/>
+            </w:tcMar>
+          </w:tcPr>
+          <w:p>
+            <w:pPr>
+              <w:spacing w:after="40"/>
+            </w:pPr>
+            <w:r>
+              <w:rPr>
+                <w:rFonts w:ascii="Segoe UI" w:cs="Segoe UI" w:eastAsia="Segoe UI" w:hAnsi="Segoe UI"/>
+                <w:sz w:val="18"/>
+                <w:szCs w:val="18"/>
+              </w:rPr>
+              <w:t xml:space="preserve">Create a custom role; tick rights in the grid; set start page and voter-profile view.</w:t>
+            </w:r>
+          </w:p>
+        </w:tc>
+        <w:tc>
+          <w:tcPr>
+            <w:tcW w:type="dxa" w:w="3700"/>
+            <w:tcMar>
+              <w:top w:type="dxa" w:w="60"/>
+              <w:left w:type="dxa" w:w="90"/>
+              <w:bottom w:type="dxa" w:w="60"/>
+              <w:right w:type="dxa" w:w="90"/>
+            </w:tcMar>
+          </w:tcPr>
+          <w:p>
+            <w:pPr>
+              <w:spacing w:after="40"/>
+            </w:pPr>
+            <w:r>
+              <w:rPr>
+                <w:rFonts w:ascii="Segoe UI" w:cs="Segoe UI" w:eastAsia="Segoe UI" w:hAnsi="Segoe UI"/>
+                <w:sz w:val="18"/>
+                <w:szCs w:val="18"/>
+              </w:rPr>
+              <w:t xml:space="preserve">Users with the role get exactly those rights within a minute; built-in roles can't be renamed or deleted.</w:t>
+            </w:r>
+          </w:p>
+        </w:tc>
+        <w:tc>
+          <w:tcPr>
+            <w:tcW w:type="dxa" w:w="1500"/>
+            <w:tcMar>
+              <w:top w:type="dxa" w:w="60"/>
+              <w:left w:type="dxa" w:w="90"/>
+              <w:bottom w:type="dxa" w:w="60"/>
+              <w:right w:type="dxa" w:w="90"/>
+            </w:tcMar>
+          </w:tcPr>
+          <w:p>
+            <w:pPr>
+              <w:spacing w:after="40"/>
+            </w:pPr>
+            <w:r>
+              <w:rPr>
+                <w:rFonts w:ascii="Segoe UI" w:cs="Segoe UI" w:eastAsia="Segoe UI" w:hAnsi="Segoe UI"/>
+                <w:sz w:val="18"/>
+                <w:szCs w:val="18"/>
+              </w:rPr>
+              <w:t xml:space="preserve">Administrator</w:t>
+            </w:r>
+          </w:p>
+        </w:tc>
+        <w:tc>
+          <w:tcPr>
+            <w:tcW w:type="dxa" w:w="800"/>
+            <w:tcMar>
+              <w:top w:type="dxa" w:w="60"/>
+              <w:left w:type="dxa" w:w="90"/>
+              <w:bottom w:type="dxa" w:w="60"/>
+              <w:right w:type="dxa" w:w="90"/>
+            </w:tcMar>
+          </w:tcPr>
+          <w:p>
+            <w:pPr>
+              <w:spacing w:after="40"/>
+            </w:pPr>
+            <w:r>
+              <w:rPr>
+                <w:rFonts w:ascii="Segoe UI" w:cs="Segoe UI" w:eastAsia="Segoe UI" w:hAnsi="Segoe UI"/>
+                <w:sz w:val="18"/>
+                <w:szCs w:val="18"/>
+              </w:rPr>
+              <w:t xml:space="preserve"/>
+            </w:r>
+          </w:p>
+        </w:tc>
+        <w:tc>
+          <w:tcPr>
+            <w:tcW w:type="dxa" w:w="1600"/>
             <w:tcMar>
               <w:top w:type="dxa" w:w="60"/>
               <w:left w:type="dxa" w:w="90"/>
@@ -21131,7 +21304,7 @@
                 <w:sz w:val="18"/>
                 <w:szCs w:val="18"/>
               </w:rPr>
-              <w:t xml:space="preserve">6</w:t>
+              <w:t xml:space="preserve">7</w:t>
             </w:r>
           </w:p>
         </w:tc>
@@ -21727,7 +21900,7 @@
                 <w:sz w:val="18"/>
                 <w:szCs w:val="18"/>
               </w:rPr>
-              <w:t xml:space="preserve">77</w:t>
+              <w:t xml:space="preserve">78</w:t>
             </w:r>
           </w:p>
         </w:tc>

</xml_diff>